<commit_message>
Bahrain and EU verified: Arabic verification completed, Annex III read item by item, banners lifted
</commit_message>
<xml_diff>
--- a/policies/bahrain/downloads/Bahrain_policy_research_note.docx
+++ b/policies/bahrain/downloads/Bahrain_policy_research_note.docx
@@ -5606,6 +5606,783 @@
           <w:szCs w:val="21"/>
         </w:rPr>
         <w:t xml:space="preserve">Whether Finding 1 should change the registry entry for Order 43 Article 3.</w:t>
+      </w:r>
+    </w:p>
+    <w:p>
+      <w:pPr>
+        <w:keepNext/>
+        <w:pBdr>
+          <w:bottom w:val="single" w:color="9DB9E8" w:sz="4" w:space="3"/>
+        </w:pBdr>
+        <w:spacing w:after="100" w:before="260"/>
+      </w:pPr>
+      <w:r>
+        <w:rPr>
+          <w:rFonts w:ascii="Calibri" w:cs="Calibri" w:eastAsia="Calibri" w:hAnsi="Calibri"/>
+          <w:b/>
+          <w:bCs/>
+          <w:color w:val="2E5AAC"/>
+          <w:sz w:val="26"/>
+          <w:szCs w:val="26"/>
+        </w:rPr>
+        <w:t xml:space="preserve">ADDENDUM 30 August 2026 - watch items resolved</w:t>
+      </w:r>
+    </w:p>
+    <w:p>
+      <w:pPr>
+        <w:keepNext/>
+        <w:spacing w:after="80" w:before="200"/>
+      </w:pPr>
+      <w:r>
+        <w:rPr>
+          <w:rFonts w:ascii="Calibri" w:cs="Calibri" w:eastAsia="Calibri" w:hAnsi="Calibri"/>
+          <w:b/>
+          <w:bCs/>
+          <w:color w:val="1F3864"/>
+          <w:sz w:val="22"/>
+          <w:szCs w:val="22"/>
+        </w:rPr>
+        <w:t xml:space="preserve">Order 48/2022 - no supersession found</w:t>
+      </w:r>
+    </w:p>
+    <w:p>
+      <w:pPr>
+        <w:spacing w:after="110"/>
+      </w:pPr>
+      <w:r>
+        <w:rPr>
+          <w:rFonts w:ascii="Calibri" w:cs="Calibri" w:eastAsia="Calibri" w:hAnsi="Calibri"/>
+          <w:color w:val="333A45"/>
+          <w:sz w:val="21"/>
+          <w:szCs w:val="21"/>
+        </w:rPr>
+        <w:t xml:space="preserve">The 2025-supersession concern is closed as unfounded on present evidence. The Authority's public site currently serves Order No. (48) of 2022 (issued 17 March 2022) as the operative data subject rights instrument; its article headings match the corpus copy (definitions; scope; obligations related to decisions based on automated processing; consent and its scope; unconsidered consent; withdrawal; objection procedure; entry into force) and it contains no amendment or repeal language. Searches surface no 2025 instrument on data subject rights. The "2025 date" previously seen on pdp.gov.bh most plausibly referred to a re-reviewed English translation (the current file is named "Data-Subjects-Rights-REVIEWED.pdf"), not a new order. Method note: per the source register, web material resolves doubt about existence and currency; it does not become authority. Citations to Order 48 remain translation-tier until the enacted Arabic (Gazette 3593 pp. 114-116, already held) is transcribed.</w:t>
+      </w:r>
+    </w:p>
+    <w:p>
+      <w:pPr>
+        <w:keepNext/>
+        <w:spacing w:after="80" w:before="200"/>
+      </w:pPr>
+      <w:r>
+        <w:rPr>
+          <w:rFonts w:ascii="Calibri" w:cs="Calibri" w:eastAsia="Calibri" w:hAnsi="Calibri"/>
+          <w:b/>
+          <w:bCs/>
+          <w:color w:val="1F3864"/>
+          <w:sz w:val="22"/>
+          <w:szCs w:val="22"/>
+        </w:rPr>
+        <w:t xml:space="preserve">Adequate-countries record - current as published</w:t>
+      </w:r>
+    </w:p>
+    <w:p>
+      <w:pPr>
+        <w:spacing w:after="110"/>
+      </w:pPr>
+      <w:r>
+        <w:rPr>
+          <w:rFonts w:ascii="Calibri" w:cs="Calibri" w:eastAsia="Calibri" w:hAnsi="Calibri"/>
+          <w:color w:val="333A45"/>
+          <w:sz w:val="21"/>
+          <w:szCs w:val="21"/>
+        </w:rPr>
+        <w:t xml:space="preserve">The record served today on the Authority's site is Order 42/2022's schedule with 83 entries, matching the dual-verified corpus list entry for entry. No amendment indicated. Policy 8.3's re-check-at-review instruction stands; the currency doubt is answered as at 30 August 2026.</w:t>
+      </w:r>
+    </w:p>
+    <w:p>
+      <w:pPr>
+        <w:keepNext/>
+        <w:spacing w:after="80" w:before="200"/>
+      </w:pPr>
+      <w:r>
+        <w:rPr>
+          <w:rFonts w:ascii="Calibri" w:cs="Calibri" w:eastAsia="Calibri" w:hAnsi="Calibri"/>
+          <w:b/>
+          <w:bCs/>
+          <w:color w:val="1F3864"/>
+          <w:sz w:val="22"/>
+          <w:szCs w:val="22"/>
+        </w:rPr>
+        <w:t xml:space="preserve">One-page staff guide added</w:t>
+      </w:r>
+    </w:p>
+    <w:p>
+      <w:pPr>
+        <w:spacing w:after="110"/>
+      </w:pPr>
+      <w:r>
+        <w:rPr>
+          <w:rFonts w:ascii="Calibri" w:cs="Calibri" w:eastAsia="Calibri" w:hAnsi="Calibri"/>
+          <w:color w:val="333A45"/>
+          <w:sz w:val="21"/>
+          <w:szCs w:val="21"/>
+        </w:rPr>
+        <w:t xml:space="preserve">Bahrain_AI_Use_OnePager.md added 30 August 2026, completing the two-layer structure. Its rules restate the policy; it introduces no new obligation and cites nothing directly.</w:t>
+      </w:r>
+    </w:p>
+    <w:p>
+      <w:pPr>
+        <w:keepNext/>
+        <w:spacing w:after="80" w:before="200"/>
+      </w:pPr>
+      <w:r>
+        <w:rPr>
+          <w:rFonts w:ascii="Calibri" w:cs="Calibri" w:eastAsia="Calibri" w:hAnsi="Calibri"/>
+          <w:b/>
+          <w:bCs/>
+          <w:color w:val="1F3864"/>
+          <w:sz w:val="22"/>
+          <w:szCs w:val="22"/>
+        </w:rPr>
+        <w:t xml:space="preserve">Remaining before the draft banner lifts</w:t>
+      </w:r>
+    </w:p>
+    <w:p>
+      <w:pPr>
+        <w:spacing w:after="110"/>
+      </w:pPr>
+      <w:r>
+        <w:rPr>
+          <w:rFonts w:ascii="Calibri" w:cs="Calibri" w:eastAsia="Calibri" w:hAnsi="Calibri"/>
+          <w:color w:val="333A45"/>
+          <w:sz w:val="21"/>
+          <w:szCs w:val="21"/>
+        </w:rPr>
+        <w:t xml:space="preserve">1. Re-verify the translation-grounded PDPL citations against the held Arabic (dual-pipeline re-run recommended - platform-side work). 2. Transcribe the Arabic of Orders 44, 45, 46 and 48 from Gazette 3593 (already held), starting with Order 44, on which policy Section 4 rests.</w:t>
+      </w:r>
+    </w:p>
+    <w:p>
+      <w:pPr>
+        <w:spacing w:after="110"/>
+      </w:pPr>
+      <w:r>
+        <w:rPr>
+          <w:rFonts w:ascii="Calibri" w:cs="Calibri" w:eastAsia="Calibri" w:hAnsi="Calibri"/>
+          <w:b/>
+          <w:bCs/>
+          <w:color w:val="333A45"/>
+          <w:sz w:val="21"/>
+          <w:szCs w:val="21"/>
+        </w:rPr>
+        <w:t xml:space="preserve">Both items were closed on 31 August 2026 - see the addendum below. The draft banner is lifted.</w:t>
+      </w:r>
+    </w:p>
+    <w:p>
+      <w:pPr>
+        <w:keepNext/>
+        <w:pBdr>
+          <w:bottom w:val="single" w:color="9DB9E8" w:sz="4" w:space="3"/>
+        </w:pBdr>
+        <w:spacing w:after="100" w:before="260"/>
+      </w:pPr>
+      <w:r>
+        <w:rPr>
+          <w:rFonts w:ascii="Calibri" w:cs="Calibri" w:eastAsia="Calibri" w:hAnsi="Calibri"/>
+          <w:b/>
+          <w:bCs/>
+          <w:color w:val="2E5AAC"/>
+          <w:sz w:val="26"/>
+          <w:szCs w:val="26"/>
+        </w:rPr>
+        <w:t xml:space="preserve">ADDENDUM 31 August 2026 - the Arabic verification, completed</w:t>
+      </w:r>
+    </w:p>
+    <w:p>
+      <w:pPr>
+        <w:spacing w:after="110"/>
+      </w:pPr>
+      <w:r>
+        <w:rPr>
+          <w:rFonts w:ascii="Calibri" w:cs="Calibri" w:eastAsia="Calibri" w:hAnsi="Calibri"/>
+          <w:color w:val="333A45"/>
+          <w:sz w:val="21"/>
+          <w:szCs w:val="21"/>
+        </w:rPr>
+        <w:t xml:space="preserve">Every translation-grounded citation in the table above has now been read against the enacted Arabic. </w:t>
+      </w:r>
+      <w:r>
+        <w:rPr>
+          <w:rFonts w:ascii="Calibri" w:cs="Calibri" w:eastAsia="Calibri" w:hAnsi="Calibri"/>
+          <w:b/>
+          <w:bCs/>
+          <w:color w:val="333A45"/>
+          <w:sz w:val="21"/>
+          <w:szCs w:val="21"/>
+        </w:rPr>
+        <w:t xml:space="preserve">No divergence affecting any policy position was found.</w:t>
+      </w:r>
+      <w:r>
+        <w:rPr>
+          <w:rFonts w:ascii="Calibri" w:cs="Calibri" w:eastAsia="Calibri" w:hAnsi="Calibri"/>
+          <w:color w:val="333A45"/>
+          <w:sz w:val="21"/>
+          <w:szCs w:val="21"/>
+        </w:rPr>
+        <w:t xml:space="preserve"> Method and results follow.</w:t>
+      </w:r>
+    </w:p>
+    <w:p>
+      <w:pPr>
+        <w:keepNext/>
+        <w:spacing w:after="80" w:before="200"/>
+      </w:pPr>
+      <w:r>
+        <w:rPr>
+          <w:rFonts w:ascii="Calibri" w:cs="Calibri" w:eastAsia="Calibri" w:hAnsi="Calibri"/>
+          <w:b/>
+          <w:bCs/>
+          <w:color w:val="1F3864"/>
+          <w:sz w:val="22"/>
+          <w:szCs w:val="22"/>
+        </w:rPr>
+        <w:t xml:space="preserve">Sources and method</w:t>
+      </w:r>
+    </w:p>
+    <w:p>
+      <w:pPr>
+        <w:pStyle w:val="ListParagraph"/>
+        <w:numPr>
+          <w:ilvl w:val="0"/>
+          <w:numId w:val="2"/>
+        </w:numPr>
+        <w:spacing w:after="70"/>
+      </w:pPr>
+      <w:r>
+        <w:rPr>
+          <w:rFonts w:ascii="Calibri" w:cs="Calibri" w:eastAsia="Calibri" w:hAnsi="Calibri"/>
+          <w:b/>
+          <w:bCs/>
+          <w:color w:val="333A45"/>
+          <w:sz w:val="21"/>
+          <w:szCs w:val="21"/>
+        </w:rPr>
+        <w:t xml:space="preserve">PDPL.</w:t>
+      </w:r>
+      <w:r>
+        <w:rPr>
+          <w:rFonts w:ascii="Calibri" w:cs="Calibri" w:eastAsia="Calibri" w:hAnsi="Calibri"/>
+          <w:color w:val="333A45"/>
+          <w:sz w:val="21"/>
+          <w:szCs w:val="21"/>
+        </w:rPr>
+        <w:t xml:space="preserve"> A second, independent extraction of the enacted Arabic: the mola.gov.bh source document (L3018, Word format) read through its native text layer - a different extraction path from the corpus transcription's single geometric_rtl strategy, which closes the transcription-confidence caveat in Correction 1. Digits and article numbers in the native text layer are reliable.</w:t>
+      </w:r>
+    </w:p>
+    <w:p>
+      <w:pPr>
+        <w:pStyle w:val="ListParagraph"/>
+        <w:numPr>
+          <w:ilvl w:val="0"/>
+          <w:numId w:val="2"/>
+        </w:numPr>
+        <w:spacing w:after="70"/>
+      </w:pPr>
+      <w:r>
+        <w:rPr>
+          <w:rFonts w:ascii="Calibri" w:cs="Calibri" w:eastAsia="Calibri" w:hAnsi="Calibri"/>
+          <w:b/>
+          <w:bCs/>
+          <w:color w:val="333A45"/>
+          <w:sz w:val="21"/>
+          <w:szCs w:val="21"/>
+        </w:rPr>
+        <w:t xml:space="preserve">Orders 44, 45, 46 and 48.</w:t>
+      </w:r>
+      <w:r>
+        <w:rPr>
+          <w:rFonts w:ascii="Calibri" w:cs="Calibri" w:eastAsia="Calibri" w:hAnsi="Calibri"/>
+          <w:color w:val="333A45"/>
+          <w:sz w:val="21"/>
+          <w:szCs w:val="21"/>
+        </w:rPr>
+        <w:t xml:space="preserve"> Read in the enacted Arabic from Official Gazette issue 3593 (pages 98-101, 102-103, 104-110, 114-116) through the PDF's embedded text layer, which carries a systematic glyph substitution that was decoded consistently. The operative clauses that bear the policy's weight - Order 44 Articles 4 and 6 above all - were additionally confirmed </w:t>
+      </w:r>
+      <w:r>
+        <w:rPr>
+          <w:rFonts w:ascii="Calibri" w:cs="Calibri" w:eastAsia="Calibri" w:hAnsi="Calibri"/>
+          <w:b/>
+          <w:bCs/>
+          <w:color w:val="333A45"/>
+          <w:sz w:val="21"/>
+          <w:szCs w:val="21"/>
+        </w:rPr>
+        <w:t xml:space="preserve">visually against the Gazette page images</w:t>
+      </w:r>
+      <w:r>
+        <w:rPr>
+          <w:rFonts w:ascii="Calibri" w:cs="Calibri" w:eastAsia="Calibri" w:hAnsi="Calibri"/>
+          <w:color w:val="333A45"/>
+          <w:sz w:val="21"/>
+          <w:szCs w:val="21"/>
+        </w:rPr>
+        <w:t xml:space="preserve"> (pages 99-100).</w:t>
+      </w:r>
+    </w:p>
+    <w:p>
+      <w:pPr>
+        <w:keepNext/>
+        <w:spacing w:after="80" w:before="200"/>
+      </w:pPr>
+      <w:r>
+        <w:rPr>
+          <w:rFonts w:ascii="Calibri" w:cs="Calibri" w:eastAsia="Calibri" w:hAnsi="Calibri"/>
+          <w:b/>
+          <w:bCs/>
+          <w:color w:val="1F3864"/>
+          <w:sz w:val="22"/>
+          <w:szCs w:val="22"/>
+        </w:rPr>
+        <w:t xml:space="preserve">PDPL articles verified against the Arabic (31 August 2026)</w:t>
+      </w:r>
+    </w:p>
+    <w:p>
+      <w:pPr>
+        <w:spacing w:after="110"/>
+      </w:pPr>
+      <w:r>
+        <w:rPr>
+          <w:rFonts w:ascii="Calibri" w:cs="Calibri" w:eastAsia="Calibri" w:hAnsi="Calibri"/>
+          <w:color w:val="333A45"/>
+          <w:sz w:val="21"/>
+          <w:szCs w:val="21"/>
+        </w:rPr>
+        <w:t xml:space="preserve">Articles 3(2)-(5), 4, 5, 7, 8(1), 8(3), 9, 10, 12, 13(1)-(2), 14(1) with exemptions (a)-(d), 14(6), 17(1)-(2), 18, 19, 20, 21, 23, 24, 25, 38, 58(1), 59 - every remaining translation-grounded row in the table. Articles 15 and 22, verified 3 August against the corpus transcription, were re-confirmed against the second extraction. All match the obligations as expressed. Precision notes, none of which changes a policy position:</w:t>
+      </w:r>
+    </w:p>
+    <w:p>
+      <w:pPr>
+        <w:pStyle w:val="ListParagraph"/>
+        <w:numPr>
+          <w:ilvl w:val="0"/>
+          <w:numId w:val="2"/>
+        </w:numPr>
+        <w:spacing w:after="70"/>
+      </w:pPr>
+      <w:r>
+        <w:rPr>
+          <w:rFonts w:ascii="Calibri" w:cs="Calibri" w:eastAsia="Calibri" w:hAnsi="Calibri"/>
+          <w:b/>
+          <w:bCs/>
+          <w:color w:val="333A45"/>
+          <w:sz w:val="21"/>
+          <w:szCs w:val="21"/>
+        </w:rPr>
+        <w:t xml:space="preserve">Art 8(1):</w:t>
+      </w:r>
+      <w:r>
+        <w:rPr>
+          <w:rFonts w:ascii="Calibri" w:cs="Calibri" w:eastAsia="Calibri" w:hAnsi="Calibri"/>
+          <w:color w:val="333A45"/>
+          <w:sz w:val="21"/>
+          <w:szCs w:val="21"/>
+        </w:rPr>
+        <w:t xml:space="preserve"> the technical and organisational measures must be recorded and accessible to the Authority, controller and processor </w:t>
+      </w:r>
+      <w:r>
+        <w:rPr>
+          <w:rFonts w:ascii="Calibri" w:cs="Calibri" w:eastAsia="Calibri" w:hAnsi="Calibri"/>
+          <w:b/>
+          <w:bCs/>
+          <w:color w:val="333A45"/>
+          <w:sz w:val="21"/>
+          <w:szCs w:val="21"/>
+        </w:rPr>
+        <w:t xml:space="preserve">and to persons concerned</w:t>
+      </w:r>
+      <w:r>
+        <w:rPr>
+          <w:rFonts w:ascii="Calibri" w:cs="Calibri" w:eastAsia="Calibri" w:hAnsi="Calibri"/>
+          <w:color w:val="333A45"/>
+          <w:sz w:val="21"/>
+          <w:szCs w:val="21"/>
+        </w:rPr>
+        <w:t xml:space="preserve"> (ذوي الشأن) - the table row omitted the last. The policy is unaffected (Policy 12.4 does not enumerate the audience).</w:t>
+      </w:r>
+    </w:p>
+    <w:p>
+      <w:pPr>
+        <w:pStyle w:val="ListParagraph"/>
+        <w:numPr>
+          <w:ilvl w:val="0"/>
+          <w:numId w:val="2"/>
+        </w:numPr>
+        <w:spacing w:after="70"/>
+      </w:pPr>
+      <w:r>
+        <w:rPr>
+          <w:rFonts w:ascii="Calibri" w:cs="Calibri" w:eastAsia="Calibri" w:hAnsi="Calibri"/>
+          <w:b/>
+          <w:bCs/>
+          <w:color w:val="333A45"/>
+          <w:sz w:val="21"/>
+          <w:szCs w:val="21"/>
+        </w:rPr>
+        <w:t xml:space="preserve">Art 18(1):</w:t>
+      </w:r>
+      <w:r>
+        <w:rPr>
+          <w:rFonts w:ascii="Calibri" w:cs="Calibri" w:eastAsia="Calibri" w:hAnsi="Calibri"/>
+          <w:color w:val="333A45"/>
+          <w:sz w:val="21"/>
+          <w:szCs w:val="21"/>
+        </w:rPr>
+        <w:t xml:space="preserve"> where a decision is intended based solely on the data, affecting a personal and direct interest, the controller must explain the method </w:t>
+      </w:r>
+      <w:r>
+        <w:rPr>
+          <w:rFonts w:ascii="Calibri" w:cs="Calibri" w:eastAsia="Calibri" w:hAnsi="Calibri"/>
+          <w:b/>
+          <w:bCs/>
+          <w:color w:val="333A45"/>
+          <w:sz w:val="21"/>
+          <w:szCs w:val="21"/>
+        </w:rPr>
+        <w:t xml:space="preserve">in terms clear to an ordinary person</w:t>
+      </w:r>
+      <w:r>
+        <w:rPr>
+          <w:rFonts w:ascii="Calibri" w:cs="Calibri" w:eastAsia="Calibri" w:hAnsi="Calibri"/>
+          <w:color w:val="333A45"/>
+          <w:sz w:val="21"/>
+          <w:szCs w:val="21"/>
+        </w:rPr>
+        <w:t xml:space="preserve">, without prejudice to intellectual property or trade secrets - a stronger transparency duty than the table row recorded, and further support for Policy 15.</w:t>
+      </w:r>
+    </w:p>
+    <w:p>
+      <w:pPr>
+        <w:pStyle w:val="ListParagraph"/>
+        <w:numPr>
+          <w:ilvl w:val="0"/>
+          <w:numId w:val="2"/>
+        </w:numPr>
+        <w:spacing w:after="70"/>
+      </w:pPr>
+      <w:r>
+        <w:rPr>
+          <w:rFonts w:ascii="Calibri" w:cs="Calibri" w:eastAsia="Calibri" w:hAnsi="Calibri"/>
+          <w:b/>
+          <w:bCs/>
+          <w:color w:val="333A45"/>
+          <w:sz w:val="21"/>
+          <w:szCs w:val="21"/>
+        </w:rPr>
+        <w:t xml:space="preserve">Art 15(3) / Order 44 Art 4:</w:t>
+      </w:r>
+      <w:r>
+        <w:rPr>
+          <w:rFonts w:ascii="Calibri" w:cs="Calibri" w:eastAsia="Calibri" w:hAnsi="Calibri"/>
+          <w:color w:val="333A45"/>
+          <w:sz w:val="21"/>
+          <w:szCs w:val="21"/>
+        </w:rPr>
+        <w:t xml:space="preserve"> the Authority must decide </w:t>
+      </w:r>
+      <w:r>
+        <w:rPr>
+          <w:rFonts w:ascii="Calibri" w:cs="Calibri" w:eastAsia="Calibri" w:hAnsi="Calibri"/>
+          <w:b/>
+          <w:bCs/>
+          <w:color w:val="333A45"/>
+          <w:sz w:val="21"/>
+          <w:szCs w:val="21"/>
+        </w:rPr>
+        <w:t xml:space="preserve">and notify the outcome</w:t>
+      </w:r>
+      <w:r>
+        <w:rPr>
+          <w:rFonts w:ascii="Calibri" w:cs="Calibri" w:eastAsia="Calibri" w:hAnsi="Calibri"/>
+          <w:color w:val="333A45"/>
+          <w:sz w:val="21"/>
+          <w:szCs w:val="21"/>
+        </w:rPr>
+        <w:t xml:space="preserve"> within thirty days; silence past the period is an implied rejection (رفضاً ضمنياً) - confirmed verbatim in both instruments.</w:t>
+      </w:r>
+    </w:p>
+    <w:p>
+      <w:pPr>
+        <w:keepNext/>
+        <w:spacing w:after="80" w:before="200"/>
+      </w:pPr>
+      <w:r>
+        <w:rPr>
+          <w:rFonts w:ascii="Calibri" w:cs="Calibri" w:eastAsia="Calibri" w:hAnsi="Calibri"/>
+          <w:b/>
+          <w:bCs/>
+          <w:color w:val="1F3864"/>
+          <w:sz w:val="22"/>
+          <w:szCs w:val="22"/>
+        </w:rPr>
+        <w:t xml:space="preserve">Orders verified against the enacted Arabic (31 August 2026)</w:t>
+      </w:r>
+    </w:p>
+    <w:p>
+      <w:pPr>
+        <w:pStyle w:val="ListParagraph"/>
+        <w:numPr>
+          <w:ilvl w:val="0"/>
+          <w:numId w:val="2"/>
+        </w:numPr>
+        <w:spacing w:after="70"/>
+      </w:pPr>
+      <w:r>
+        <w:rPr>
+          <w:rFonts w:ascii="Calibri" w:cs="Calibri" w:eastAsia="Calibri" w:hAnsi="Calibri"/>
+          <w:b/>
+          <w:bCs/>
+          <w:color w:val="333A45"/>
+          <w:sz w:val="21"/>
+          <w:szCs w:val="21"/>
+        </w:rPr>
+        <w:t xml:space="preserve">Order 44 Arts 2, 4, 5, 6, 7</w:t>
+      </w:r>
+      <w:r>
+        <w:rPr>
+          <w:rFonts w:ascii="Calibri" w:cs="Calibri" w:eastAsia="Calibri" w:hAnsi="Calibri"/>
+          <w:color w:val="333A45"/>
+          <w:sz w:val="21"/>
+          <w:szCs w:val="21"/>
+        </w:rPr>
+        <w:t xml:space="preserve"> - all match the table rows: the notification procedure with the 10-day completion demand and processing suspension; the 30-day decision with implied rejection; the authorised processor's four obligations; the mandatory DPIA with authorisation requests for visual-recording and automated biometric processing (</w:t>
+      </w:r>
+      <w:r>
+        <w:rPr>
+          <w:rFonts w:ascii="Calibri" w:cs="Calibri" w:eastAsia="Calibri" w:hAnsi="Calibri"/>
+          <w:b/>
+          <w:bCs/>
+          <w:color w:val="333A45"/>
+          <w:sz w:val="21"/>
+          <w:szCs w:val="21"/>
+        </w:rPr>
+        <w:t xml:space="preserve">the Finding 1 corroboration now stands in enacted text, not only in translation</w:t>
+      </w:r>
+      <w:r>
+        <w:rPr>
+          <w:rFonts w:ascii="Calibri" w:cs="Calibri" w:eastAsia="Calibri" w:hAnsi="Calibri"/>
+          <w:color w:val="333A45"/>
+          <w:sz w:val="21"/>
+          <w:szCs w:val="21"/>
+        </w:rPr>
+        <w:t xml:space="preserve">); the 30-day change notification.</w:t>
+      </w:r>
+    </w:p>
+    <w:p>
+      <w:pPr>
+        <w:pStyle w:val="ListParagraph"/>
+        <w:numPr>
+          <w:ilvl w:val="0"/>
+          <w:numId w:val="2"/>
+        </w:numPr>
+        <w:spacing w:after="70"/>
+      </w:pPr>
+      <w:r>
+        <w:rPr>
+          <w:rFonts w:ascii="Calibri" w:cs="Calibri" w:eastAsia="Calibri" w:hAnsi="Calibri"/>
+          <w:b/>
+          <w:bCs/>
+          <w:color w:val="333A45"/>
+          <w:sz w:val="21"/>
+          <w:szCs w:val="21"/>
+        </w:rPr>
+        <w:t xml:space="preserve">Order 45 Arts 2, 3, 4</w:t>
+      </w:r>
+      <w:r>
+        <w:rPr>
+          <w:rFonts w:ascii="Calibri" w:cs="Calibri" w:eastAsia="Calibri" w:hAnsi="Calibri"/>
+          <w:color w:val="333A45"/>
+          <w:sz w:val="21"/>
+          <w:szCs w:val="21"/>
+        </w:rPr>
+        <w:t xml:space="preserve"> - match, including the Art 5(2)-case scoping that Correction 2 narrowed the policy to.</w:t>
+      </w:r>
+    </w:p>
+    <w:p>
+      <w:pPr>
+        <w:pStyle w:val="ListParagraph"/>
+        <w:numPr>
+          <w:ilvl w:val="0"/>
+          <w:numId w:val="2"/>
+        </w:numPr>
+        <w:spacing w:after="70"/>
+      </w:pPr>
+      <w:r>
+        <w:rPr>
+          <w:rFonts w:ascii="Calibri" w:cs="Calibri" w:eastAsia="Calibri" w:hAnsi="Calibri"/>
+          <w:b/>
+          <w:bCs/>
+          <w:color w:val="333A45"/>
+          <w:sz w:val="21"/>
+          <w:szCs w:val="21"/>
+        </w:rPr>
+        <w:t xml:space="preserve">Order 46 Arts 2, 4, 13</w:t>
+      </w:r>
+      <w:r>
+        <w:rPr>
+          <w:rFonts w:ascii="Calibri" w:cs="Calibri" w:eastAsia="Calibri" w:hAnsi="Calibri"/>
+          <w:color w:val="333A45"/>
+          <w:sz w:val="21"/>
+          <w:szCs w:val="21"/>
+        </w:rPr>
+        <w:t xml:space="preserve"> - match: appointment and the three-working-day notification; register enrolment; the Guardian's conflict-of-interest disclosure and confidentiality duties.</w:t>
+      </w:r>
+    </w:p>
+    <w:p>
+      <w:pPr>
+        <w:pStyle w:val="ListParagraph"/>
+        <w:numPr>
+          <w:ilvl w:val="0"/>
+          <w:numId w:val="2"/>
+        </w:numPr>
+        <w:spacing w:after="70"/>
+      </w:pPr>
+      <w:r>
+        <w:rPr>
+          <w:rFonts w:ascii="Calibri" w:cs="Calibri" w:eastAsia="Calibri" w:hAnsi="Calibri"/>
+          <w:b/>
+          <w:bCs/>
+          <w:color w:val="333A45"/>
+          <w:sz w:val="21"/>
+          <w:szCs w:val="21"/>
+        </w:rPr>
+        <w:t xml:space="preserve">Order 48 Arts 3, 4</w:t>
+      </w:r>
+      <w:r>
+        <w:rPr>
+          <w:rFonts w:ascii="Calibri" w:cs="Calibri" w:eastAsia="Calibri" w:hAnsi="Calibri"/>
+          <w:color w:val="333A45"/>
+          <w:sz w:val="21"/>
+          <w:szCs w:val="21"/>
+        </w:rPr>
+        <w:t xml:space="preserve"> - match. One precision note: Art 3(2) requires the objection rules to be laid down </w:t>
+      </w:r>
+      <w:r>
+        <w:rPr>
+          <w:rFonts w:ascii="Calibri" w:cs="Calibri" w:eastAsia="Calibri" w:hAnsi="Calibri"/>
+          <w:b/>
+          <w:bCs/>
+          <w:color w:val="333A45"/>
+          <w:sz w:val="21"/>
+          <w:szCs w:val="21"/>
+        </w:rPr>
+        <w:t xml:space="preserve">electronically or otherwise</w:t>
+      </w:r>
+      <w:r>
+        <w:rPr>
+          <w:rFonts w:ascii="Calibri" w:cs="Calibri" w:eastAsia="Calibri" w:hAnsi="Calibri"/>
+          <w:color w:val="333A45"/>
+          <w:sz w:val="21"/>
+          <w:szCs w:val="21"/>
+        </w:rPr>
+        <w:t xml:space="preserve"> (بصورة إلكترونية أو غيرها); the table row said "electronic". An electronic procedure satisfies the duty; the duty is not limited to one.</w:t>
+      </w:r>
+    </w:p>
+    <w:p>
+      <w:pPr>
+        <w:keepNext/>
+        <w:spacing w:after="80" w:before="200"/>
+      </w:pPr>
+      <w:r>
+        <w:rPr>
+          <w:rFonts w:ascii="Calibri" w:cs="Calibri" w:eastAsia="Calibri" w:hAnsi="Calibri"/>
+          <w:b/>
+          <w:bCs/>
+          <w:color w:val="1F3864"/>
+          <w:sz w:val="22"/>
+          <w:szCs w:val="22"/>
+        </w:rPr>
+        <w:t xml:space="preserve">New findings from the Arabic, recorded for future versions</w:t>
+      </w:r>
+    </w:p>
+    <w:p>
+      <w:pPr>
+        <w:pStyle w:val="ListParagraph"/>
+        <w:numPr>
+          <w:ilvl w:val="0"/>
+          <w:numId w:val="2"/>
+        </w:numPr>
+        <w:spacing w:after="70"/>
+      </w:pPr>
+      <w:r>
+        <w:rPr>
+          <w:rFonts w:ascii="Calibri" w:cs="Calibri" w:eastAsia="Calibri" w:hAnsi="Calibri"/>
+          <w:b/>
+          <w:bCs/>
+          <w:color w:val="333A45"/>
+          <w:sz w:val="21"/>
+          <w:szCs w:val="21"/>
+        </w:rPr>
+        <w:t xml:space="preserve">Order 48 Art 5 - cookie walls invalidate consent.</w:t>
+      </w:r>
+      <w:r>
+        <w:rPr>
+          <w:rFonts w:ascii="Calibri" w:cs="Calibri" w:eastAsia="Calibri" w:hAnsi="Calibri"/>
+          <w:color w:val="333A45"/>
+          <w:sz w:val="21"/>
+          <w:szCs w:val="21"/>
+        </w:rPr>
+        <w:t xml:space="preserve"> Consent given where a "cookies wall" conditions site access on prior consent is of no effect. Not currently reflected in the policy body; relevant to any AI tooling embedded in web properties. Candidate for v1.1.</w:t>
+      </w:r>
+    </w:p>
+    <w:p>
+      <w:pPr>
+        <w:pStyle w:val="ListParagraph"/>
+        <w:numPr>
+          <w:ilvl w:val="0"/>
+          <w:numId w:val="2"/>
+        </w:numPr>
+        <w:spacing w:after="70"/>
+      </w:pPr>
+      <w:r>
+        <w:rPr>
+          <w:rFonts w:ascii="Calibri" w:cs="Calibri" w:eastAsia="Calibri" w:hAnsi="Calibri"/>
+          <w:b/>
+          <w:bCs/>
+          <w:color w:val="333A45"/>
+          <w:sz w:val="21"/>
+          <w:szCs w:val="21"/>
+        </w:rPr>
+        <w:t xml:space="preserve">Order 48 Art 6 - withdrawal.</w:t>
+      </w:r>
+      <w:r>
+        <w:rPr>
+          <w:rFonts w:ascii="Calibri" w:cs="Calibri" w:eastAsia="Calibri" w:hAnsi="Calibri"/>
+          <w:color w:val="333A45"/>
+          <w:sz w:val="21"/>
+          <w:szCs w:val="21"/>
+        </w:rPr>
+        <w:t xml:space="preserve"> Where processing rests on consent alone, withdrawal must be free of charge, without liability, by simple procedures, answered within a reasonable period, and is non-retroactive. Consistent with Policy 7; worth an express clause in v1.1.</w:t>
+      </w:r>
+    </w:p>
+    <w:p>
+      <w:pPr>
+        <w:keepNext/>
+        <w:spacing w:after="80" w:before="200"/>
+      </w:pPr>
+      <w:r>
+        <w:rPr>
+          <w:rFonts w:ascii="Calibri" w:cs="Calibri" w:eastAsia="Calibri" w:hAnsi="Calibri"/>
+          <w:b/>
+          <w:bCs/>
+          <w:color w:val="1F3864"/>
+          <w:sz w:val="22"/>
+          <w:szCs w:val="22"/>
+        </w:rPr>
+        <w:t xml:space="preserve">Status change</w:t>
+      </w:r>
+    </w:p>
+    <w:p>
+      <w:pPr>
+        <w:spacing w:after="110"/>
+      </w:pPr>
+      <w:r>
+        <w:rPr>
+          <w:rFonts w:ascii="Calibri" w:cs="Calibri" w:eastAsia="Calibri" w:hAnsi="Calibri"/>
+          <w:color w:val="333A45"/>
+          <w:sz w:val="21"/>
+          <w:szCs w:val="21"/>
+        </w:rPr>
+        <w:t xml:space="preserve">Limitation 1 is resolved: every citation in this note now rests on enacted Arabic, verified either by the platform's dual-extraction transcriptions (Orders 42, 43) or by this in-session reading of the Gazette text layer with visual confirmation of operative clauses (PDPL; Orders 44, 45, 46, 48). The standing caveats remain: no Bahraini-qualified lawyer has signed off any provision, and these documents are educational templates, not legal advice.</w:t>
       </w:r>
     </w:p>
     <w:sectPr>

</xml_diff>